<commit_message>
Corrección de documentación y versión final
</commit_message>
<xml_diff>
--- a/DOCUMENTACIÓN Y MANUALES/DOCUMENTACIÓN.docx
+++ b/DOCUMENTACIÓN Y MANUALES/DOCUMENTACIÓN.docx
@@ -828,21 +828,8 @@
         <w:pStyle w:val="Ttulo2"/>
       </w:pPr>
       <w:r>
-        <w:t xml:space="preserve">2.2. </w:t>
-      </w:r>
-      <w:proofErr w:type="spellStart"/>
-      <w:r>
-        <w:t>Objetivos</w:t>
-      </w:r>
-      <w:proofErr w:type="spellEnd"/>
-      <w:r>
-        <w:t xml:space="preserve"> </w:t>
-      </w:r>
-      <w:proofErr w:type="spellStart"/>
-      <w:r>
-        <w:t>específicos</w:t>
-      </w:r>
-      <w:proofErr w:type="spellEnd"/>
+        <w:t>2.2. Objetivos específicos</w:t>
+      </w:r>
     </w:p>
     <w:p>
       <w:pPr>
@@ -1357,29 +1344,8 @@
         <w:pStyle w:val="Ttulo2"/>
       </w:pPr>
       <w:r>
-        <w:t xml:space="preserve">3.3. </w:t>
-      </w:r>
-      <w:proofErr w:type="spellStart"/>
-      <w:r>
-        <w:t>Archivos</w:t>
-      </w:r>
-      <w:proofErr w:type="spellEnd"/>
-      <w:r>
-        <w:t xml:space="preserve"> y </w:t>
-      </w:r>
-      <w:proofErr w:type="spellStart"/>
-      <w:r>
-        <w:t>módulos</w:t>
-      </w:r>
-      <w:proofErr w:type="spellEnd"/>
-      <w:r>
-        <w:t xml:space="preserve"> </w:t>
-      </w:r>
-      <w:proofErr w:type="spellStart"/>
-      <w:r>
-        <w:t>principales</w:t>
-      </w:r>
-      <w:proofErr w:type="spellEnd"/>
+        <w:t>3.3. Archivos y módulos principales</w:t>
+      </w:r>
     </w:p>
     <w:tbl>
       <w:tblPr>
@@ -3970,7 +3936,71 @@
           <w:color w:val="000000" w:themeColor="text1"/>
           <w:lang w:val="es-GT"/>
         </w:rPr>
-        <w:t>La información que se almacena depende de los eventos configurados en el código. La consulta de registros facilita revisar las actividades realizadas y detectar posibles problemas.</w:t>
+        <w:t>La consulta de registros facilita revisar las actividades realizadas y detectar posibles problemas.</w:t>
+      </w:r>
+      <w:r>
+        <w:rPr>
+          <w:rFonts w:ascii="Arial" w:hAnsi="Arial" w:cs="Arial"/>
+          <w:bCs/>
+          <w:color w:val="000000" w:themeColor="text1"/>
+          <w:lang w:val="es-GT"/>
+        </w:rPr>
+        <w:br/>
+      </w:r>
+      <w:r>
+        <w:rPr>
+          <w:rFonts w:ascii="Arial" w:hAnsi="Arial" w:cs="Arial"/>
+          <w:bCs/>
+          <w:color w:val="000000" w:themeColor="text1"/>
+          <w:lang w:val="es-GT"/>
+        </w:rPr>
+        <w:br/>
+      </w:r>
+      <w:r>
+        <w:rPr>
+          <w:rFonts w:ascii="Arial" w:hAnsi="Arial" w:cs="Arial"/>
+          <w:bCs/>
+          <w:color w:val="000000" w:themeColor="text1"/>
+          <w:lang w:val="es-GT"/>
+        </w:rPr>
+        <w:br/>
+      </w:r>
+      <w:r>
+        <w:rPr>
+          <w:rFonts w:ascii="Arial" w:hAnsi="Arial" w:cs="Arial"/>
+          <w:bCs/>
+          <w:color w:val="000000" w:themeColor="text1"/>
+          <w:lang w:val="es-GT"/>
+        </w:rPr>
+        <w:br/>
+      </w:r>
+      <w:r>
+        <w:rPr>
+          <w:rFonts w:ascii="Arial" w:hAnsi="Arial" w:cs="Arial"/>
+          <w:bCs/>
+          <w:color w:val="000000" w:themeColor="text1"/>
+          <w:lang w:val="es-GT"/>
+        </w:rPr>
+        <w:br/>
+      </w:r>
+      <w:r>
+        <w:rPr>
+          <w:rFonts w:ascii="Arial" w:hAnsi="Arial" w:cs="Arial"/>
+          <w:bCs/>
+          <w:color w:val="000000" w:themeColor="text1"/>
+          <w:lang w:val="es-GT"/>
+        </w:rPr>
+        <w:br/>
+      </w:r>
+      <w:r>
+        <w:rPr>
+          <w:rFonts w:ascii="Arial" w:hAnsi="Arial" w:cs="Arial"/>
+          <w:bCs/>
+          <w:color w:val="000000" w:themeColor="text1"/>
+          <w:lang w:val="es-GT"/>
+        </w:rPr>
+        <w:lastRenderedPageBreak/>
+        <w:br/>
       </w:r>
     </w:p>
     <w:sectPr>

</xml_diff>